<commit_message>
docs: record the eligibility gate moving to bookings
The architecture document said gate 3 still used the letter domain and that
POST /bookings was ungated. Both are now false. Updates the gate table with
the booking domain, adds the challenge endpoint, marks POST /bookings as
requiring a proof, and records why 2a had to run before the deletion.

Test counts follow the code: 168 -> 182.

Co-Authored-By: Claude Opus 5 <noreply@anthropic.com>
</commit_message>
<xml_diff>
--- a/docs/ARSITEKTUR.docx
+++ b/docs/ARSITEKTUR.docx
@@ -45,7 +45,7 @@
       <w:tr>
         <w:tc>
           <w:tcPr>
-            <w:tcW w:type="dxa" w:w="2784"/>
+            <w:tcW w:type="dxa" w:w="2070"/>
             <w:shd w:val="clear" w:fill="1F3A5F"/>
             <w:tcMar>
               <w:top w:w="40" w:type="dxa"/>
@@ -74,7 +74,7 @@
         </w:tc>
         <w:tc>
           <w:tcPr>
-            <w:tcW w:type="dxa" w:w="6570"/>
+            <w:tcW w:type="dxa" w:w="7285"/>
             <w:shd w:val="clear" w:fill="1F3A5F"/>
             <w:tcMar>
               <w:top w:w="40" w:type="dxa"/>
@@ -105,7 +105,7 @@
       <w:tr>
         <w:tc>
           <w:tcPr>
-            <w:tcW w:type="dxa" w:w="2784"/>
+            <w:tcW w:type="dxa" w:w="2070"/>
             <w:tcMar>
               <w:top w:w="40" w:type="dxa"/>
               <w:bottom w:w="40" w:type="dxa"/>
@@ -130,7 +130,7 @@
         </w:tc>
         <w:tc>
           <w:tcPr>
-            <w:tcW w:type="dxa" w:w="6570"/>
+            <w:tcW w:type="dxa" w:w="7285"/>
             <w:tcMar>
               <w:top w:w="40" w:type="dxa"/>
               <w:bottom w:w="40" w:type="dxa"/>
@@ -156,7 +156,7 @@
       <w:tr>
         <w:tc>
           <w:tcPr>
-            <w:tcW w:type="dxa" w:w="2784"/>
+            <w:tcW w:type="dxa" w:w="2070"/>
             <w:tcMar>
               <w:top w:w="40" w:type="dxa"/>
               <w:bottom w:w="40" w:type="dxa"/>
@@ -182,7 +182,7 @@
         </w:tc>
         <w:tc>
           <w:tcPr>
-            <w:tcW w:type="dxa" w:w="6570"/>
+            <w:tcW w:type="dxa" w:w="7285"/>
             <w:tcMar>
               <w:top w:w="40" w:type="dxa"/>
               <w:bottom w:w="40" w:type="dxa"/>
@@ -209,7 +209,7 @@
                 <w:color w:val="B03060"/>
                 <w:sz w:val="19"/>
               </w:rPr>
-              <w:t>a616fef</w:t>
+              <w:t>9974e01</w:t>
             </w:r>
             <w:r>
               <w:rPr>
@@ -223,7 +223,7 @@
                 <w:color w:val="B03060"/>
                 <w:sz w:val="19"/>
               </w:rPr>
-              <w:t>main</w:t>
+              <w:t>feat/booking-eligibility-gate</w:t>
             </w:r>
           </w:p>
         </w:tc>
@@ -231,7 +231,7 @@
       <w:tr>
         <w:tc>
           <w:tcPr>
-            <w:tcW w:type="dxa" w:w="2784"/>
+            <w:tcW w:type="dxa" w:w="2070"/>
             <w:tcMar>
               <w:top w:w="40" w:type="dxa"/>
               <w:bottom w:w="40" w:type="dxa"/>
@@ -256,7 +256,7 @@
         </w:tc>
         <w:tc>
           <w:tcPr>
-            <w:tcW w:type="dxa" w:w="6570"/>
+            <w:tcW w:type="dxa" w:w="7285"/>
             <w:tcMar>
               <w:top w:w="40" w:type="dxa"/>
               <w:bottom w:w="40" w:type="dxa"/>
@@ -274,7 +274,7 @@
               <w:rPr>
                 <w:sz w:val="19"/>
               </w:rPr>
-              <w:t>Tahap 1 (penyatuan gerbang identitas) selesai dan tergabung</w:t>
+              <w:t>Tahap 1 selesai dan tergabung; Tahap 2a (gerbang kelayakan pindah ke janji temu) selesai</w:t>
             </w:r>
           </w:p>
         </w:tc>
@@ -1393,7 +1393,7 @@
               <w:rPr>
                 <w:sz w:val="19"/>
               </w:rPr>
-              <w:t>100</w:t>
+              <w:t>112</w:t>
             </w:r>
           </w:p>
         </w:tc>
@@ -1483,7 +1483,7 @@
               <w:rPr>
                 <w:sz w:val="19"/>
               </w:rPr>
-              <w:t>34</w:t>
+              <w:t>36</w:t>
             </w:r>
           </w:p>
         </w:tc>
@@ -1498,7 +1498,7 @@
         <w:rPr>
           <w:b/>
         </w:rPr>
-        <w:t>Total 168 pengujian otomatis.</w:t>
+        <w:t>Total 182 pengujian otomatis.</w:t>
       </w:r>
       <w:r>
         <w:t xml:space="preserve"> Pengujian ditulis lebih dahulu (TDD) dan tidak pernah dilemahkan untuk membuat rangkaian menjadi hijau.</w:t>
@@ -1545,7 +1545,7 @@
       <w:tr>
         <w:tc>
           <w:tcPr>
-            <w:tcW w:type="dxa" w:w="1254"/>
+            <w:tcW w:type="dxa" w:w="1299"/>
             <w:shd w:val="clear" w:fill="1F3A5F"/>
             <w:tcMar>
               <w:top w:w="40" w:type="dxa"/>
@@ -1574,7 +1574,7 @@
         </w:tc>
         <w:tc>
           <w:tcPr>
-            <w:tcW w:type="dxa" w:w="2665"/>
+            <w:tcW w:type="dxa" w:w="2650"/>
             <w:shd w:val="clear" w:fill="1F3A5F"/>
             <w:tcMar>
               <w:top w:w="40" w:type="dxa"/>
@@ -1603,7 +1603,7 @@
         </w:tc>
         <w:tc>
           <w:tcPr>
-            <w:tcW w:type="dxa" w:w="5435"/>
+            <w:tcW w:type="dxa" w:w="5405"/>
             <w:shd w:val="clear" w:fill="1F3A5F"/>
             <w:tcMar>
               <w:top w:w="40" w:type="dxa"/>
@@ -1634,7 +1634,7 @@
       <w:tr>
         <w:tc>
           <w:tcPr>
-            <w:tcW w:type="dxa" w:w="1254"/>
+            <w:tcW w:type="dxa" w:w="1299"/>
             <w:tcMar>
               <w:top w:w="40" w:type="dxa"/>
               <w:bottom w:w="40" w:type="dxa"/>
@@ -1659,7 +1659,7 @@
         </w:tc>
         <w:tc>
           <w:tcPr>
-            <w:tcW w:type="dxa" w:w="2665"/>
+            <w:tcW w:type="dxa" w:w="2650"/>
             <w:tcMar>
               <w:top w:w="40" w:type="dxa"/>
               <w:bottom w:w="40" w:type="dxa"/>
@@ -1685,7 +1685,7 @@
         </w:tc>
         <w:tc>
           <w:tcPr>
-            <w:tcW w:type="dxa" w:w="5435"/>
+            <w:tcW w:type="dxa" w:w="5405"/>
             <w:tcMar>
               <w:top w:w="40" w:type="dxa"/>
               <w:bottom w:w="40" w:type="dxa"/>
@@ -1711,7 +1711,7 @@
       <w:tr>
         <w:tc>
           <w:tcPr>
-            <w:tcW w:type="dxa" w:w="1254"/>
+            <w:tcW w:type="dxa" w:w="1299"/>
             <w:tcMar>
               <w:top w:w="40" w:type="dxa"/>
               <w:bottom w:w="40" w:type="dxa"/>
@@ -1737,7 +1737,7 @@
         </w:tc>
         <w:tc>
           <w:tcPr>
-            <w:tcW w:type="dxa" w:w="2665"/>
+            <w:tcW w:type="dxa" w:w="2650"/>
             <w:tcMar>
               <w:top w:w="40" w:type="dxa"/>
               <w:bottom w:w="40" w:type="dxa"/>
@@ -1764,7 +1764,7 @@
         </w:tc>
         <w:tc>
           <w:tcPr>
-            <w:tcW w:type="dxa" w:w="5435"/>
+            <w:tcW w:type="dxa" w:w="5405"/>
             <w:tcMar>
               <w:top w:w="40" w:type="dxa"/>
               <w:bottom w:w="40" w:type="dxa"/>
@@ -1791,7 +1791,7 @@
       <w:tr>
         <w:tc>
           <w:tcPr>
-            <w:tcW w:type="dxa" w:w="1254"/>
+            <w:tcW w:type="dxa" w:w="1299"/>
             <w:tcMar>
               <w:top w:w="40" w:type="dxa"/>
               <w:bottom w:w="40" w:type="dxa"/>
@@ -1810,13 +1810,13 @@
                 <w:b/>
                 <w:sz w:val="19"/>
               </w:rPr>
-              <w:t>3. Kelayakan</w:t>
+              <w:t>3. Kelayakan (janji temu)</w:t>
             </w:r>
           </w:p>
         </w:tc>
         <w:tc>
           <w:tcPr>
-            <w:tcW w:type="dxa" w:w="2665"/>
+            <w:tcW w:type="dxa" w:w="2650"/>
             <w:tcMar>
               <w:top w:w="40" w:type="dxa"/>
               <w:bottom w:w="40" w:type="dxa"/>
@@ -1836,13 +1836,13 @@
                 <w:color w:val="B03060"/>
                 <w:sz w:val="19"/>
               </w:rPr>
-              <w:t>SIDESA-letter-eligibility-v1 ‖ akun ‖ jenis ‖ nonce</w:t>
+              <w:t>SIDESA-booking-eligibility-v1 ‖ akun ‖ nonce</w:t>
             </w:r>
           </w:p>
         </w:tc>
         <w:tc>
           <w:tcPr>
-            <w:tcW w:type="dxa" w:w="5435"/>
+            <w:tcW w:type="dxa" w:w="5405"/>
             <w:tcMar>
               <w:top w:w="40" w:type="dxa"/>
               <w:bottom w:w="40" w:type="dxa"/>
@@ -1874,6 +1874,86 @@
                 <w:sz w:val="19"/>
               </w:rPr>
               <w:t xml:space="preserve"> menguasai kunci yang dikomitmenkan daun Merkle-nya</w:t>
+            </w:r>
+          </w:p>
+        </w:tc>
+      </w:tr>
+      <w:tr>
+        <w:tc>
+          <w:tcPr>
+            <w:tcW w:type="dxa" w:w="1299"/>
+            <w:tcMar>
+              <w:top w:w="40" w:type="dxa"/>
+              <w:bottom w:w="40" w:type="dxa"/>
+              <w:start w:w="80" w:type="dxa"/>
+              <w:end w:w="80" w:type="dxa"/>
+            </w:tcMar>
+            <w:shd w:val="clear" w:fill="EEF2F7"/>
+          </w:tcPr>
+          <w:p>
+            <w:r>
+              <w:rPr>
+                <w:sz w:val="19"/>
+              </w:rPr>
+            </w:r>
+            <w:r>
+              <w:rPr>
+                <w:i/>
+                <w:sz w:val="19"/>
+              </w:rPr>
+              <w:t>3b. Kelayakan (surat)</w:t>
+            </w:r>
+          </w:p>
+        </w:tc>
+        <w:tc>
+          <w:tcPr>
+            <w:tcW w:type="dxa" w:w="2650"/>
+            <w:tcMar>
+              <w:top w:w="40" w:type="dxa"/>
+              <w:bottom w:w="40" w:type="dxa"/>
+              <w:start w:w="80" w:type="dxa"/>
+              <w:end w:w="80" w:type="dxa"/>
+            </w:tcMar>
+            <w:shd w:val="clear" w:fill="EEF2F7"/>
+          </w:tcPr>
+          <w:p>
+            <w:r>
+              <w:rPr>
+                <w:sz w:val="19"/>
+              </w:rPr>
+            </w:r>
+            <w:r>
+              <w:rPr>
+                <w:rFonts w:ascii="Consolas" w:hAnsi="Consolas"/>
+                <w:color w:val="B03060"/>
+                <w:sz w:val="19"/>
+              </w:rPr>
+              <w:t>SIDESA-letter-eligibility-v1 ‖ akun ‖ jenis ‖ nonce</w:t>
+            </w:r>
+          </w:p>
+        </w:tc>
+        <w:tc>
+          <w:tcPr>
+            <w:tcW w:type="dxa" w:w="5405"/>
+            <w:tcMar>
+              <w:top w:w="40" w:type="dxa"/>
+              <w:bottom w:w="40" w:type="dxa"/>
+              <w:start w:w="80" w:type="dxa"/>
+              <w:end w:w="80" w:type="dxa"/>
+            </w:tcMar>
+            <w:shd w:val="clear" w:fill="EEF2F7"/>
+          </w:tcPr>
+          <w:p>
+            <w:r>
+              <w:rPr>
+                <w:sz w:val="19"/>
+              </w:rPr>
+            </w:r>
+            <w:r>
+              <w:rPr>
+                <w:sz w:val="19"/>
+              </w:rPr>
+              <w:t>Sama, untuk subsistem surat yang dihapus pada Tahap 2b</w:t>
             </w:r>
           </w:p>
         </w:tc>
@@ -6449,7 +6529,7 @@
       <w:tr>
         <w:tc>
           <w:tcPr>
-            <w:tcW w:type="dxa" w:w="1336"/>
+            <w:tcW w:type="dxa" w:w="902"/>
             <w:shd w:val="clear" w:fill="1F3A5F"/>
             <w:tcMar>
               <w:top w:w="40" w:type="dxa"/>
@@ -6478,7 +6558,7 @@
         </w:tc>
         <w:tc>
           <w:tcPr>
-            <w:tcW w:type="dxa" w:w="4677"/>
+            <w:tcW w:type="dxa" w:w="4367"/>
             <w:shd w:val="clear" w:fill="1F3A5F"/>
             <w:tcMar>
               <w:top w:w="40" w:type="dxa"/>
@@ -6507,7 +6587,7 @@
         </w:tc>
         <w:tc>
           <w:tcPr>
-            <w:tcW w:type="dxa" w:w="3341"/>
+            <w:tcW w:type="dxa" w:w="4085"/>
             <w:shd w:val="clear" w:fill="1F3A5F"/>
             <w:tcMar>
               <w:top w:w="40" w:type="dxa"/>
@@ -6538,7 +6618,7 @@
       <w:tr>
         <w:tc>
           <w:tcPr>
-            <w:tcW w:type="dxa" w:w="1336"/>
+            <w:tcW w:type="dxa" w:w="902"/>
             <w:tcMar>
               <w:top w:w="40" w:type="dxa"/>
               <w:bottom w:w="40" w:type="dxa"/>
@@ -6564,7 +6644,7 @@
         </w:tc>
         <w:tc>
           <w:tcPr>
-            <w:tcW w:type="dxa" w:w="4677"/>
+            <w:tcW w:type="dxa" w:w="4367"/>
             <w:tcMar>
               <w:top w:w="40" w:type="dxa"/>
               <w:bottom w:w="40" w:type="dxa"/>
@@ -6584,13 +6664,13 @@
                 <w:color w:val="B03060"/>
                 <w:sz w:val="19"/>
               </w:rPr>
-              <w:t>/bookings</w:t>
+              <w:t>/bookings/eligibility-challenge</w:t>
             </w:r>
           </w:p>
         </w:tc>
         <w:tc>
           <w:tcPr>
-            <w:tcW w:type="dxa" w:w="3341"/>
+            <w:tcW w:type="dxa" w:w="4085"/>
             <w:tcMar>
               <w:top w:w="40" w:type="dxa"/>
               <w:bottom w:w="40" w:type="dxa"/>
@@ -6616,7 +6696,7 @@
       <w:tr>
         <w:tc>
           <w:tcPr>
-            <w:tcW w:type="dxa" w:w="1336"/>
+            <w:tcW w:type="dxa" w:w="902"/>
             <w:tcMar>
               <w:top w:w="40" w:type="dxa"/>
               <w:bottom w:w="40" w:type="dxa"/>
@@ -6637,13 +6717,13 @@
                 <w:color w:val="B03060"/>
                 <w:sz w:val="19"/>
               </w:rPr>
-              <w:t>GET</w:t>
+              <w:t>POST</w:t>
             </w:r>
           </w:p>
         </w:tc>
         <w:tc>
           <w:tcPr>
-            <w:tcW w:type="dxa" w:w="4677"/>
+            <w:tcW w:type="dxa" w:w="4367"/>
             <w:tcMar>
               <w:top w:w="40" w:type="dxa"/>
               <w:bottom w:w="40" w:type="dxa"/>
@@ -6664,13 +6744,13 @@
                 <w:color w:val="B03060"/>
                 <w:sz w:val="19"/>
               </w:rPr>
-              <w:t>/bookings/mine</w:t>
+              <w:t>/bookings</w:t>
             </w:r>
           </w:p>
         </w:tc>
         <w:tc>
           <w:tcPr>
-            <w:tcW w:type="dxa" w:w="3341"/>
+            <w:tcW w:type="dxa" w:w="4085"/>
             <w:tcMar>
               <w:top w:w="40" w:type="dxa"/>
               <w:bottom w:w="40" w:type="dxa"/>
@@ -6689,7 +6769,14 @@
               <w:rPr>
                 <w:sz w:val="19"/>
               </w:rPr>
-              <w:t>WARGA</w:t>
+              <w:t xml:space="preserve">WARGA — </w:t>
+            </w:r>
+            <w:r>
+              <w:rPr>
+                <w:b/>
+                <w:sz w:val="19"/>
+              </w:rPr>
+              <w:t>wajib bukti kelayakan</w:t>
             </w:r>
           </w:p>
         </w:tc>
@@ -6697,7 +6784,7 @@
       <w:tr>
         <w:tc>
           <w:tcPr>
-            <w:tcW w:type="dxa" w:w="1336"/>
+            <w:tcW w:type="dxa" w:w="902"/>
             <w:tcMar>
               <w:top w:w="40" w:type="dxa"/>
               <w:bottom w:w="40" w:type="dxa"/>
@@ -6723,7 +6810,7 @@
         </w:tc>
         <w:tc>
           <w:tcPr>
-            <w:tcW w:type="dxa" w:w="4677"/>
+            <w:tcW w:type="dxa" w:w="4367"/>
             <w:tcMar>
               <w:top w:w="40" w:type="dxa"/>
               <w:bottom w:w="40" w:type="dxa"/>
@@ -6743,13 +6830,13 @@
                 <w:color w:val="B03060"/>
                 <w:sz w:val="19"/>
               </w:rPr>
-              <w:t>/bookings/queue</w:t>
+              <w:t>/bookings/mine</w:t>
             </w:r>
           </w:p>
         </w:tc>
         <w:tc>
           <w:tcPr>
-            <w:tcW w:type="dxa" w:w="3341"/>
+            <w:tcW w:type="dxa" w:w="4085"/>
             <w:tcMar>
               <w:top w:w="40" w:type="dxa"/>
               <w:bottom w:w="40" w:type="dxa"/>
@@ -6767,7 +6854,7 @@
               <w:rPr>
                 <w:sz w:val="19"/>
               </w:rPr>
-              <w:t>OPERATOR, KADES</w:t>
+              <w:t>WARGA</w:t>
             </w:r>
           </w:p>
         </w:tc>
@@ -6775,7 +6862,7 @@
       <w:tr>
         <w:tc>
           <w:tcPr>
-            <w:tcW w:type="dxa" w:w="1336"/>
+            <w:tcW w:type="dxa" w:w="902"/>
             <w:tcMar>
               <w:top w:w="40" w:type="dxa"/>
               <w:bottom w:w="40" w:type="dxa"/>
@@ -6796,13 +6883,13 @@
                 <w:color w:val="B03060"/>
                 <w:sz w:val="19"/>
               </w:rPr>
-              <w:t>POST</w:t>
+              <w:t>GET</w:t>
             </w:r>
           </w:p>
         </w:tc>
         <w:tc>
           <w:tcPr>
-            <w:tcW w:type="dxa" w:w="4677"/>
+            <w:tcW w:type="dxa" w:w="4367"/>
             <w:tcMar>
               <w:top w:w="40" w:type="dxa"/>
               <w:bottom w:w="40" w:type="dxa"/>
@@ -6823,13 +6910,13 @@
                 <w:color w:val="B03060"/>
                 <w:sz w:val="19"/>
               </w:rPr>
-              <w:t>/bookings/:id/confirm</w:t>
+              <w:t>/bookings/queue</w:t>
             </w:r>
           </w:p>
         </w:tc>
         <w:tc>
           <w:tcPr>
-            <w:tcW w:type="dxa" w:w="3341"/>
+            <w:tcW w:type="dxa" w:w="4085"/>
             <w:tcMar>
               <w:top w:w="40" w:type="dxa"/>
               <w:bottom w:w="40" w:type="dxa"/>
@@ -6848,7 +6935,7 @@
               <w:rPr>
                 <w:sz w:val="19"/>
               </w:rPr>
-              <w:t>KADES</w:t>
+              <w:t>OPERATOR, KADES</w:t>
             </w:r>
           </w:p>
         </w:tc>
@@ -6856,7 +6943,7 @@
       <w:tr>
         <w:tc>
           <w:tcPr>
-            <w:tcW w:type="dxa" w:w="1336"/>
+            <w:tcW w:type="dxa" w:w="902"/>
             <w:tcMar>
               <w:top w:w="40" w:type="dxa"/>
               <w:bottom w:w="40" w:type="dxa"/>
@@ -6882,7 +6969,7 @@
         </w:tc>
         <w:tc>
           <w:tcPr>
-            <w:tcW w:type="dxa" w:w="4677"/>
+            <w:tcW w:type="dxa" w:w="4367"/>
             <w:tcMar>
               <w:top w:w="40" w:type="dxa"/>
               <w:bottom w:w="40" w:type="dxa"/>
@@ -6902,13 +6989,13 @@
                 <w:color w:val="B03060"/>
                 <w:sz w:val="19"/>
               </w:rPr>
-              <w:t>/bookings/:id/cancel</w:t>
+              <w:t>/bookings/:id/confirm</w:t>
             </w:r>
           </w:p>
         </w:tc>
         <w:tc>
           <w:tcPr>
-            <w:tcW w:type="dxa" w:w="3341"/>
+            <w:tcW w:type="dxa" w:w="4085"/>
             <w:tcMar>
               <w:top w:w="40" w:type="dxa"/>
               <w:bottom w:w="40" w:type="dxa"/>
@@ -6926,7 +7013,7 @@
               <w:rPr>
                 <w:sz w:val="19"/>
               </w:rPr>
-              <w:t>OPERATOR, KADES</w:t>
+              <w:t>KADES</w:t>
             </w:r>
           </w:p>
         </w:tc>
@@ -6934,7 +7021,7 @@
       <w:tr>
         <w:tc>
           <w:tcPr>
-            <w:tcW w:type="dxa" w:w="1336"/>
+            <w:tcW w:type="dxa" w:w="902"/>
             <w:tcMar>
               <w:top w:w="40" w:type="dxa"/>
               <w:bottom w:w="40" w:type="dxa"/>
@@ -6961,7 +7048,7 @@
         </w:tc>
         <w:tc>
           <w:tcPr>
-            <w:tcW w:type="dxa" w:w="4677"/>
+            <w:tcW w:type="dxa" w:w="4367"/>
             <w:tcMar>
               <w:top w:w="40" w:type="dxa"/>
               <w:bottom w:w="40" w:type="dxa"/>
@@ -6982,13 +7069,13 @@
                 <w:color w:val="B03060"/>
                 <w:sz w:val="19"/>
               </w:rPr>
-              <w:t>/bookings/checkin</w:t>
+              <w:t>/bookings/:id/cancel</w:t>
             </w:r>
           </w:p>
         </w:tc>
         <w:tc>
           <w:tcPr>
-            <w:tcW w:type="dxa" w:w="3341"/>
+            <w:tcW w:type="dxa" w:w="4085"/>
             <w:tcMar>
               <w:top w:w="40" w:type="dxa"/>
               <w:bottom w:w="40" w:type="dxa"/>
@@ -6996,6 +7083,84 @@
               <w:end w:w="80" w:type="dxa"/>
             </w:tcMar>
             <w:shd w:val="clear" w:fill="EEF2F7"/>
+          </w:tcPr>
+          <w:p>
+            <w:r>
+              <w:rPr>
+                <w:sz w:val="19"/>
+              </w:rPr>
+            </w:r>
+            <w:r>
+              <w:rPr>
+                <w:sz w:val="19"/>
+              </w:rPr>
+              <w:t>OPERATOR, KADES</w:t>
+            </w:r>
+          </w:p>
+        </w:tc>
+      </w:tr>
+      <w:tr>
+        <w:tc>
+          <w:tcPr>
+            <w:tcW w:type="dxa" w:w="902"/>
+            <w:tcMar>
+              <w:top w:w="40" w:type="dxa"/>
+              <w:bottom w:w="40" w:type="dxa"/>
+              <w:start w:w="80" w:type="dxa"/>
+              <w:end w:w="80" w:type="dxa"/>
+            </w:tcMar>
+          </w:tcPr>
+          <w:p>
+            <w:r>
+              <w:rPr>
+                <w:sz w:val="19"/>
+              </w:rPr>
+            </w:r>
+            <w:r>
+              <w:rPr>
+                <w:rFonts w:ascii="Consolas" w:hAnsi="Consolas"/>
+                <w:color w:val="B03060"/>
+                <w:sz w:val="19"/>
+              </w:rPr>
+              <w:t>POST</w:t>
+            </w:r>
+          </w:p>
+        </w:tc>
+        <w:tc>
+          <w:tcPr>
+            <w:tcW w:type="dxa" w:w="4367"/>
+            <w:tcMar>
+              <w:top w:w="40" w:type="dxa"/>
+              <w:bottom w:w="40" w:type="dxa"/>
+              <w:start w:w="80" w:type="dxa"/>
+              <w:end w:w="80" w:type="dxa"/>
+            </w:tcMar>
+          </w:tcPr>
+          <w:p>
+            <w:r>
+              <w:rPr>
+                <w:sz w:val="19"/>
+              </w:rPr>
+            </w:r>
+            <w:r>
+              <w:rPr>
+                <w:rFonts w:ascii="Consolas" w:hAnsi="Consolas"/>
+                <w:color w:val="B03060"/>
+                <w:sz w:val="19"/>
+              </w:rPr>
+              <w:t>/bookings/checkin</w:t>
+            </w:r>
+          </w:p>
+        </w:tc>
+        <w:tc>
+          <w:tcPr>
+            <w:tcW w:type="dxa" w:w="4085"/>
+            <w:tcMar>
+              <w:top w:w="40" w:type="dxa"/>
+              <w:bottom w:w="40" w:type="dxa"/>
+              <w:start w:w="80" w:type="dxa"/>
+              <w:end w:w="80" w:type="dxa"/>
+            </w:tcMar>
           </w:tcPr>
           <w:p>
             <w:r>
@@ -9453,7 +9618,16 @@
         <w:jc w:val="both"/>
       </w:pPr>
       <w:r>
-        <w:t xml:space="preserve">Gerbang kelayakan masih memakai domain konteks </w:t>
+        <w:t xml:space="preserve">Gerbang kelayakan kini menjaga </w:t>
+      </w:r>
+      <w:r>
+        <w:rPr>
+          <w:b/>
+        </w:rPr>
+        <w:t>pemesanan janji temu</w:t>
+      </w:r>
+      <w:r>
+        <w:t xml:space="preserve">, bukan lagi hanya permohonan surat. Ini dikerjakan lebih dulu dengan sengaja: sebelumnya gerbang hanya terpasang pada </w:t>
       </w:r>
       <w:r>
         <w:rPr>
@@ -9461,10 +9635,21 @@
           <w:color w:val="B03060"/>
           <w:sz w:val="19"/>
         </w:rPr>
-        <w:t>SIDESA-letter-eligibility-v1</w:t>
+        <w:t>/letters/*</w:t>
       </w:r>
       <w:r>
-        <w:t xml:space="preserve"> — nama peninggalan yang akan disesuaikan saat subsistem antrean dikerjakan.</w:t>
+        <w:t xml:space="preserve">, sehingga menghapus subsistem surat akan ikut menghapus fitur bukti kelayakan — satu-satunya alasan produk ini ada. Kedua alur memakai domain konteks yang berbeda, dan sebuah pengujian mengirimkan bukti berkonteks surat ke </w:t>
+      </w:r>
+      <w:r>
+        <w:rPr>
+          <w:rFonts w:ascii="Consolas" w:hAnsi="Consolas"/>
+          <w:color w:val="B03060"/>
+          <w:sz w:val="19"/>
+        </w:rPr>
+        <w:t>/bookings</w:t>
+      </w:r>
+      <w:r>
+        <w:t xml:space="preserve"> untuk memastikan ditolak.</w:t>
       </w:r>
     </w:p>
     <w:p>
@@ -9648,7 +9833,7 @@
       <w:tr>
         <w:tc>
           <w:tcPr>
-            <w:tcW w:type="dxa" w:w="884"/>
+            <w:tcW w:type="dxa" w:w="893"/>
             <w:shd w:val="clear" w:fill="1F3A5F"/>
             <w:tcMar>
               <w:top w:w="40" w:type="dxa"/>
@@ -9677,7 +9862,7 @@
         </w:tc>
         <w:tc>
           <w:tcPr>
-            <w:tcW w:type="dxa" w:w="6143"/>
+            <w:tcW w:type="dxa" w:w="6137"/>
             <w:shd w:val="clear" w:fill="1F3A5F"/>
             <w:tcMar>
               <w:top w:w="40" w:type="dxa"/>
@@ -9706,7 +9891,7 @@
         </w:tc>
         <w:tc>
           <w:tcPr>
-            <w:tcW w:type="dxa" w:w="2327"/>
+            <w:tcW w:type="dxa" w:w="2325"/>
             <w:shd w:val="clear" w:fill="1F3A5F"/>
             <w:tcMar>
               <w:top w:w="40" w:type="dxa"/>
@@ -9737,7 +9922,7 @@
       <w:tr>
         <w:tc>
           <w:tcPr>
-            <w:tcW w:type="dxa" w:w="884"/>
+            <w:tcW w:type="dxa" w:w="893"/>
             <w:tcMar>
               <w:top w:w="40" w:type="dxa"/>
               <w:bottom w:w="40" w:type="dxa"/>
@@ -9762,7 +9947,7 @@
         </w:tc>
         <w:tc>
           <w:tcPr>
-            <w:tcW w:type="dxa" w:w="6143"/>
+            <w:tcW w:type="dxa" w:w="6137"/>
             <w:tcMar>
               <w:top w:w="40" w:type="dxa"/>
               <w:bottom w:w="40" w:type="dxa"/>
@@ -9786,7 +9971,7 @@
         </w:tc>
         <w:tc>
           <w:tcPr>
-            <w:tcW w:type="dxa" w:w="2327"/>
+            <w:tcW w:type="dxa" w:w="2325"/>
             <w:tcMar>
               <w:top w:w="40" w:type="dxa"/>
               <w:bottom w:w="40" w:type="dxa"/>
@@ -9826,7 +10011,7 @@
       <w:tr>
         <w:tc>
           <w:tcPr>
-            <w:tcW w:type="dxa" w:w="884"/>
+            <w:tcW w:type="dxa" w:w="893"/>
             <w:tcMar>
               <w:top w:w="40" w:type="dxa"/>
               <w:bottom w:w="40" w:type="dxa"/>
@@ -9846,13 +10031,13 @@
                 <w:b/>
                 <w:sz w:val="19"/>
               </w:rPr>
-              <w:t>Tahap 2</w:t>
+              <w:t>Tahap 2a</w:t>
             </w:r>
           </w:p>
         </w:tc>
         <w:tc>
           <w:tcPr>
-            <w:tcW w:type="dxa" w:w="6143"/>
+            <w:tcW w:type="dxa" w:w="6137"/>
             <w:tcMar>
               <w:top w:w="40" w:type="dxa"/>
               <w:bottom w:w="40" w:type="dxa"/>
@@ -9871,13 +10056,13 @@
               <w:rPr>
                 <w:sz w:val="19"/>
               </w:rPr>
-              <w:t>Penghapusan subsistem surat, ECDSA, PDF/QR, keystore hardware</w:t>
+              <w:t>Pemindahan gerbang kelayakan ke pemesanan janji temu</w:t>
             </w:r>
           </w:p>
         </w:tc>
         <w:tc>
           <w:tcPr>
-            <w:tcW w:type="dxa" w:w="2327"/>
+            <w:tcW w:type="dxa" w:w="2325"/>
             <w:tcMar>
               <w:top w:w="40" w:type="dxa"/>
               <w:bottom w:w="40" w:type="dxa"/>
@@ -9896,7 +10081,21 @@
               <w:rPr>
                 <w:sz w:val="19"/>
               </w:rPr>
-              <w:t>Siap dikerjakan</w:t>
+              <w:t>✅ Selesai (</w:t>
+            </w:r>
+            <w:r>
+              <w:rPr>
+                <w:rFonts w:ascii="Consolas" w:hAnsi="Consolas"/>
+                <w:color w:val="B03060"/>
+                <w:sz w:val="19"/>
+              </w:rPr>
+              <w:t>9974e01</w:t>
+            </w:r>
+            <w:r>
+              <w:rPr>
+                <w:sz w:val="19"/>
+              </w:rPr>
+              <w:t>)</w:t>
             </w:r>
           </w:p>
         </w:tc>
@@ -9904,7 +10103,7 @@
       <w:tr>
         <w:tc>
           <w:tcPr>
-            <w:tcW w:type="dxa" w:w="884"/>
+            <w:tcW w:type="dxa" w:w="893"/>
             <w:tcMar>
               <w:top w:w="40" w:type="dxa"/>
               <w:bottom w:w="40" w:type="dxa"/>
@@ -9923,13 +10122,13 @@
                 <w:b/>
                 <w:sz w:val="19"/>
               </w:rPr>
-              <w:t>Tahap 3</w:t>
+              <w:t>Tahap 2b</w:t>
             </w:r>
           </w:p>
         </w:tc>
         <w:tc>
           <w:tcPr>
-            <w:tcW w:type="dxa" w:w="6143"/>
+            <w:tcW w:type="dxa" w:w="6137"/>
             <w:tcMar>
               <w:top w:w="40" w:type="dxa"/>
               <w:bottom w:w="40" w:type="dxa"/>
@@ -9947,20 +10146,13 @@
               <w:rPr>
                 <w:sz w:val="19"/>
               </w:rPr>
-              <w:t xml:space="preserve">Subsistem antrean </w:t>
-            </w:r>
-            <w:r>
-              <w:rPr>
-                <w:i/>
-                <w:sz w:val="19"/>
-              </w:rPr>
-              <w:t>real-time</w:t>
+              <w:t>Penghapusan subsistem surat, ECDSA, PDF/QR, keystore hardware</w:t>
             </w:r>
           </w:p>
         </w:tc>
         <w:tc>
           <w:tcPr>
-            <w:tcW w:type="dxa" w:w="2327"/>
+            <w:tcW w:type="dxa" w:w="2325"/>
             <w:tcMar>
               <w:top w:w="40" w:type="dxa"/>
               <w:bottom w:w="40" w:type="dxa"/>
@@ -9978,7 +10170,7 @@
               <w:rPr>
                 <w:sz w:val="19"/>
               </w:rPr>
-              <w:t>⏸ Menunggu wawancara desa</w:t>
+              <w:t>Siap dikerjakan</w:t>
             </w:r>
           </w:p>
         </w:tc>
@@ -9986,7 +10178,7 @@
       <w:tr>
         <w:tc>
           <w:tcPr>
-            <w:tcW w:type="dxa" w:w="884"/>
+            <w:tcW w:type="dxa" w:w="893"/>
             <w:tcMar>
               <w:top w:w="40" w:type="dxa"/>
               <w:bottom w:w="40" w:type="dxa"/>
@@ -10006,13 +10198,13 @@
                 <w:b/>
                 <w:sz w:val="19"/>
               </w:rPr>
-              <w:t>Tahap 4</w:t>
+              <w:t>Tahap 3</w:t>
             </w:r>
           </w:p>
         </w:tc>
         <w:tc>
           <w:tcPr>
-            <w:tcW w:type="dxa" w:w="6143"/>
+            <w:tcW w:type="dxa" w:w="6137"/>
             <w:tcMar>
               <w:top w:w="40" w:type="dxa"/>
               <w:bottom w:w="40" w:type="dxa"/>
@@ -10031,26 +10223,20 @@
               <w:rPr>
                 <w:sz w:val="19"/>
               </w:rPr>
-              <w:t xml:space="preserve">Pengerasan: </w:t>
+              <w:t xml:space="preserve">Subsistem antrean </w:t>
             </w:r>
             <w:r>
               <w:rPr>
                 <w:i/>
                 <w:sz w:val="19"/>
               </w:rPr>
-              <w:t>pepper</w:t>
-            </w:r>
-            <w:r>
-              <w:rPr>
-                <w:sz w:val="19"/>
-              </w:rPr>
-              <w:t xml:space="preserve"> untuk komitmen NIK, rotasi kunci, TLS, atestasi</w:t>
+              <w:t>real-time</w:t>
             </w:r>
           </w:p>
         </w:tc>
         <w:tc>
           <w:tcPr>
-            <w:tcW w:type="dxa" w:w="2327"/>
+            <w:tcW w:type="dxa" w:w="2325"/>
             <w:tcMar>
               <w:top w:w="40" w:type="dxa"/>
               <w:bottom w:w="40" w:type="dxa"/>
@@ -10069,7 +10255,7 @@
               <w:rPr>
                 <w:sz w:val="19"/>
               </w:rPr>
-              <w:t>Terencana</w:t>
+              <w:t>⏸ Menunggu wawancara desa</w:t>
             </w:r>
           </w:p>
         </w:tc>
@@ -10077,7 +10263,7 @@
       <w:tr>
         <w:tc>
           <w:tcPr>
-            <w:tcW w:type="dxa" w:w="884"/>
+            <w:tcW w:type="dxa" w:w="893"/>
             <w:tcMar>
               <w:top w:w="40" w:type="dxa"/>
               <w:bottom w:w="40" w:type="dxa"/>
@@ -10096,13 +10282,13 @@
                 <w:b/>
                 <w:sz w:val="19"/>
               </w:rPr>
-              <w:t>Tahap 5</w:t>
+              <w:t>Tahap 4</w:t>
             </w:r>
           </w:p>
         </w:tc>
         <w:tc>
           <w:tcPr>
-            <w:tcW w:type="dxa" w:w="6143"/>
+            <w:tcW w:type="dxa" w:w="6137"/>
             <w:tcMar>
               <w:top w:w="40" w:type="dxa"/>
               <w:bottom w:w="40" w:type="dxa"/>
@@ -10120,19 +10306,110 @@
               <w:rPr>
                 <w:sz w:val="19"/>
               </w:rPr>
-              <w:t>Uji lapangan, SOP, pelatihan, serah terima</w:t>
+              <w:t xml:space="preserve">Pengerasan: </w:t>
+            </w:r>
+            <w:r>
+              <w:rPr>
+                <w:i/>
+                <w:sz w:val="19"/>
+              </w:rPr>
+              <w:t>pepper</w:t>
+            </w:r>
+            <w:r>
+              <w:rPr>
+                <w:sz w:val="19"/>
+              </w:rPr>
+              <w:t xml:space="preserve"> untuk komitmen NIK, rotasi kunci, TLS, atestasi</w:t>
             </w:r>
           </w:p>
         </w:tc>
         <w:tc>
           <w:tcPr>
-            <w:tcW w:type="dxa" w:w="2327"/>
+            <w:tcW w:type="dxa" w:w="2325"/>
             <w:tcMar>
               <w:top w:w="40" w:type="dxa"/>
               <w:bottom w:w="40" w:type="dxa"/>
               <w:start w:w="80" w:type="dxa"/>
               <w:end w:w="80" w:type="dxa"/>
             </w:tcMar>
+          </w:tcPr>
+          <w:p>
+            <w:r>
+              <w:rPr>
+                <w:sz w:val="19"/>
+              </w:rPr>
+            </w:r>
+            <w:r>
+              <w:rPr>
+                <w:sz w:val="19"/>
+              </w:rPr>
+              <w:t>Terencana</w:t>
+            </w:r>
+          </w:p>
+        </w:tc>
+      </w:tr>
+      <w:tr>
+        <w:tc>
+          <w:tcPr>
+            <w:tcW w:type="dxa" w:w="893"/>
+            <w:tcMar>
+              <w:top w:w="40" w:type="dxa"/>
+              <w:bottom w:w="40" w:type="dxa"/>
+              <w:start w:w="80" w:type="dxa"/>
+              <w:end w:w="80" w:type="dxa"/>
+            </w:tcMar>
+            <w:shd w:val="clear" w:fill="EEF2F7"/>
+          </w:tcPr>
+          <w:p>
+            <w:r>
+              <w:rPr>
+                <w:sz w:val="19"/>
+              </w:rPr>
+            </w:r>
+            <w:r>
+              <w:rPr>
+                <w:b/>
+                <w:sz w:val="19"/>
+              </w:rPr>
+              <w:t>Tahap 5</w:t>
+            </w:r>
+          </w:p>
+        </w:tc>
+        <w:tc>
+          <w:tcPr>
+            <w:tcW w:type="dxa" w:w="6137"/>
+            <w:tcMar>
+              <w:top w:w="40" w:type="dxa"/>
+              <w:bottom w:w="40" w:type="dxa"/>
+              <w:start w:w="80" w:type="dxa"/>
+              <w:end w:w="80" w:type="dxa"/>
+            </w:tcMar>
+            <w:shd w:val="clear" w:fill="EEF2F7"/>
+          </w:tcPr>
+          <w:p>
+            <w:r>
+              <w:rPr>
+                <w:sz w:val="19"/>
+              </w:rPr>
+            </w:r>
+            <w:r>
+              <w:rPr>
+                <w:sz w:val="19"/>
+              </w:rPr>
+              <w:t>Uji lapangan, SOP, pelatihan, serah terima</w:t>
+            </w:r>
+          </w:p>
+        </w:tc>
+        <w:tc>
+          <w:tcPr>
+            <w:tcW w:type="dxa" w:w="2325"/>
+            <w:tcMar>
+              <w:top w:w="40" w:type="dxa"/>
+              <w:bottom w:w="40" w:type="dxa"/>
+              <w:start w:w="80" w:type="dxa"/>
+              <w:end w:w="80" w:type="dxa"/>
+            </w:tcMar>
+            <w:shd w:val="clear" w:fill="EEF2F7"/>
           </w:tcPr>
           <w:p>
             <w:r>
@@ -10559,7 +10836,7 @@
         <w:rPr>
           <w:i/>
         </w:rPr>
-        <w:t>Dokumen ini merujuk keadaan repositori pada commit `a616fef`. Setiap klaim mengenai kendali keamanan dapat ditelusuri sampai ke berkas pengujian yang menegakkannya.</w:t>
+        <w:t>Dokumen ini merujuk keadaan repositori pada commit `9974e01`. Setiap klaim mengenai kendali keamanan dapat ditelusuri sampai ke berkas pengujian yang menegakkannya.</w:t>
       </w:r>
     </w:p>
     <w:sectPr>

</xml_diff>